<commit_message>
fix(pdf): emoji normalization, code block background, spacing improvements
- Add _EMOJI_MAP to replace emoji (✅❌💡 etc) with text equivalents
- Add _emoji_to_text() helper for SMP emoji (U+1F000+)
- Replace symbols: ☆▶↻▲▼✅❌⭐⚠ etc with ASCII text
- Fix _chapter_title storing raw text with emoji (header used it unnormalized)
- Strip variation selector (U+FE0F) and backspace control char
- Regenerate all 4 books with fixed compiled.md (code blocks from cleaned sources)
- All PDF outputs regenerated with improved rendering
- Tests 14/14 passing, 0 inconsistencies, KDP synced
</commit_message>
<xml_diff>
--- a/knowledge-factory/products/books/backend-architecture/output/livro.docx
+++ b/knowledge-factory/products/books/backend-architecture/output/livro.docx
@@ -6649,13 +6649,13 @@
         <w:br/>
         <w:br/>
         <w:br/>
-        <w:t># Arquitetura Multi-Tenant</w:t>
-        <w:br/>
-        <w:br/>
-        <w:t># Módulo 13 — Multi-Tenant: Construindo SaaS Escalável</w:t>
-        <w:br/>
-        <w:br/>
-        <w:t>**Como isolar dados, identidade e recursos entre clientes em uma única aplicação.**</w:t>
+        <w:t># Multi-Tenant: Conceitos e Estratégias de Isolamento</w:t>
+        <w:br/>
+        <w:br/>
+        <w:t># Módulo 13 — Multi-Tenant: Conceitos e Estratégias de Isolamento</w:t>
+        <w:br/>
+        <w:br/>
+        <w:t>**Conceitos fundamentais, três abordagens de isolamento de dados e análise comparativa por dimensão.**</w:t>
         <w:br/>
         <w:br/>
         <w:t>---</w:t>
@@ -7620,13 +7620,25 @@
         <w:t>---</w:t>
         <w:br/>
         <w:br/>
-        <w:t>## 4. Identificação do Tenant</w:t>
+        <w:br/>
+        <w:br/>
+        <w:br/>
+        <w:t># Multi-Tenant: Implementação com NestJS e Prisma</w:t>
+        <w:br/>
+        <w:br/>
+        <w:t># Módulo 13b — Multi-Tenant: Implementação com NestJS e Prisma</w:t>
+        <w:br/>
+        <w:br/>
+        <w:t>**Middleware de tenant, identificação, serviços NestJS e integração com Prisma para isolamento de dados.**</w:t>
+        <w:br/>
+        <w:br/>
+        <w:t>## 1. Identificação do Tenant</w:t>
         <w:br/>
         <w:br/>
         <w:t>O sistema precisa identificar **qual tenant está fazendo a requisição** antes de qualquer lógica de negócio.</w:t>
         <w:br/>
         <w:br/>
-        <w:t>### 4.1 Estratégias de Identificação</w:t>
+        <w:t>### 1.1 Estratégias de Identificação</w:t>
         <w:br/>
         <w:br/>
         <w:t>| Estratégia | Exemplo | Segurança | Complexidade | Ideal para |</w:t>
@@ -7644,7 +7656,7 @@
         <w:t>| **DNS + SSL** | SNI com cert por tenant | Alta | Alta | Enterprise |</w:t>
         <w:br/>
         <w:br/>
-        <w:t>### 4.2 Subdomínio</w:t>
+        <w:t>### 1.2 Subdomínio</w:t>
         <w:br/>
       </w:r>
     </w:p>
@@ -7707,7 +7719,7 @@
           <w:sz w:val="18"/>
         </w:rPr>
         <w:br/>
-        <w:t>### 4.3 Header HTTP</w:t>
+        <w:t>### 1.3 Header HTTP</w:t>
         <w:br/>
       </w:r>
     </w:p>
@@ -7771,7 +7783,7 @@
           <w:sz w:val="18"/>
         </w:rPr>
         <w:br/>
-        <w:t>### 4.4 JWT Claim</w:t>
+        <w:t>### 1.4 JWT Claim</w:t>
         <w:br/>
       </w:r>
     </w:p>
@@ -7853,7 +7865,7 @@
           <w:sz w:val="18"/>
         </w:rPr>
         <w:br/>
-        <w:t>### 4.5 Path Parameter</w:t>
+        <w:t>### 1.5 Path Parameter</w:t>
         <w:br/>
       </w:r>
     </w:p>
@@ -7891,7 +7903,7 @@
           <w:sz w:val="18"/>
         </w:rPr>
         <w:br/>
-        <w:t>### 4.6 Estratégia Combinada (Fallback)</w:t>
+        <w:t>### 1.6 Estratégia Combinada (Fallback)</w:t>
         <w:br/>
       </w:r>
     </w:p>
@@ -7940,10 +7952,10 @@
         <w:t>---</w:t>
         <w:br/>
         <w:br/>
-        <w:t>## 5. Middleware de Tenant</w:t>
-        <w:br/>
-        <w:br/>
-        <w:t>### 5.1 Implementação com NestJS</w:t>
+        <w:t>## 2. Middleware de Tenant</w:t>
+        <w:br/>
+        <w:br/>
+        <w:t>### 2.1 Implementação com NestJS</w:t>
         <w:br/>
       </w:r>
     </w:p>
@@ -8165,7 +8177,7 @@
           <w:sz w:val="18"/>
         </w:rPr>
         <w:br/>
-        <w:t>### 5.2 Aplicação Global ou por Rota</w:t>
+        <w:t>### 2.2 Aplicação Global ou por Rota</w:t>
         <w:br/>
       </w:r>
     </w:p>
@@ -8230,7 +8242,7 @@
           <w:sz w:val="18"/>
         </w:rPr>
         <w:br/>
-        <w:t>### 5.3 TenantModule</w:t>
+        <w:t>### 2.3 TenantModule</w:t>
         <w:br/>
       </w:r>
     </w:p>
@@ -8279,7 +8291,7 @@
           <w:sz w:val="18"/>
         </w:rPr>
         <w:br/>
-        <w:t>### 5.4 TenantService</w:t>
+        <w:t>### 2.4 TenantService</w:t>
         <w:br/>
       </w:r>
     </w:p>
@@ -8384,7 +8396,7 @@
           <w:sz w:val="18"/>
         </w:rPr>
         <w:br/>
-        <w:t>### 5.5 @Tenant() Decorator</w:t>
+        <w:t>### 2.5 @Tenant() Decorator</w:t>
         <w:br/>
       </w:r>
     </w:p>
@@ -8467,7 +8479,7 @@
           <w:sz w:val="18"/>
         </w:rPr>
         <w:br/>
-        <w:t>### 5.6 AsyncLocalStorage para Contexto</w:t>
+        <w:t>### 2.6 AsyncLocalStorage para Contexto</w:t>
         <w:br/>
       </w:r>
     </w:p>
@@ -8573,10 +8585,10 @@
         <w:t>---</w:t>
         <w:br/>
         <w:br/>
-        <w:t>## 6. Prisma Multi-Tenant</w:t>
-        <w:br/>
-        <w:br/>
-        <w:t>### 6.1 Schema per Tenant com Prisma</w:t>
+        <w:t>## 3. Prisma Multi-Tenant</w:t>
+        <w:br/>
+        <w:br/>
+        <w:t>### 3.1 Schema per Tenant com Prisma</w:t>
         <w:br/>
       </w:r>
     </w:p>
@@ -8771,7 +8783,7 @@
           <w:sz w:val="18"/>
         </w:rPr>
         <w:br/>
-        <w:t>### 6.2 Shared Database com Prisma</w:t>
+        <w:t>### 3.2 Shared Database com Prisma</w:t>
         <w:br/>
       </w:r>
     </w:p>
@@ -8958,7 +8970,7 @@
           <w:sz w:val="18"/>
         </w:rPr>
         <w:br/>
-        <w:t>### 6.3 Prisma Middleware para Tenant</w:t>
+        <w:t>### 3.3 Prisma Middleware para Tenant</w:t>
         <w:br/>
       </w:r>
     </w:p>
@@ -9049,7 +9061,7 @@
           <w:sz w:val="18"/>
         </w:rPr>
         <w:br/>
-        <w:t>### 6.4 Prisma Extension (Prisma &gt;= 5.0)</w:t>
+        <w:t>### 3.4 Prisma Extension (Prisma &gt;= 5.0)</w:t>
         <w:br/>
       </w:r>
     </w:p>
@@ -9136,13 +9148,22 @@
           <w:sz w:val="18"/>
         </w:rPr>
         <w:br/>
-        <w:t>---</w:t>
-        <w:br/>
-        <w:br/>
-        <w:t>## 7. Migrations Multi-Tenant</w:t>
-        <w:br/>
-        <w:br/>
-        <w:t>### 7.1 Database per Tenant</w:t>
+        <w:br/>
+        <w:br/>
+        <w:br/>
+        <w:t># Multi-Tenant: Migrations, Dados e Seed</w:t>
+        <w:br/>
+        <w:br/>
+        <w:t># Módulo 13c — Multi-Tenant: Migrations, Dados e Seed</w:t>
+        <w:br/>
+        <w:br/>
+        <w:t>**Migrations multi-tenant, estratégias de dados compartilhados vs isolados e seed automático por tenant.**</w:t>
+        <w:br/>
+        <w:br/>
+        <w:t>## 1. Migrations Multi-Tenant</w:t>
+        <w:br/>
+        <w:br/>
+        <w:t>### 1.1 Database per Tenant</w:t>
         <w:br/>
       </w:r>
     </w:p>
@@ -9294,7 +9315,7 @@
           <w:sz w:val="18"/>
         </w:rPr>
         <w:br/>
-        <w:t>### 7.2 Schema per Tenant</w:t>
+        <w:t>### 1.2 Schema per Tenant</w:t>
         <w:br/>
       </w:r>
     </w:p>
@@ -9568,7 +9589,7 @@
           <w:sz w:val="18"/>
         </w:rPr>
         <w:br/>
-        <w:t>### 7.3 Estratégias de Rollback</w:t>
+        <w:t>### 1.3 Estratégias de Rollback</w:t>
         <w:br/>
       </w:r>
     </w:p>
@@ -9711,7 +9732,7 @@
           <w:sz w:val="18"/>
         </w:rPr>
         <w:br/>
-        <w:t>### 7.4 Shared Database</w:t>
+        <w:t>### 1.4 Shared Database</w:t>
         <w:br/>
       </w:r>
     </w:p>
@@ -9811,10 +9832,10 @@
         <w:t>---</w:t>
         <w:br/>
         <w:br/>
-        <w:t>## 8. Dados Compartilhados vs Por Tenant</w:t>
-        <w:br/>
-        <w:br/>
-        <w:t>### 8.1 Tabelas Globais (Compartilhadas)</w:t>
+        <w:t>## 2. Dados Compartilhados vs Por Tenant</w:t>
+        <w:br/>
+        <w:br/>
+        <w:t>### 2.1 Tabelas Globais (Compartilhadas)</w:t>
         <w:br/>
         <w:br/>
         <w:t>Dados que **não pertencem a nenhum tenant específico** e são comuns a todos:</w:t>
@@ -9908,7 +9929,7 @@
           <w:sz w:val="18"/>
         </w:rPr>
         <w:br/>
-        <w:t>### 8.2 Tabelas Por Tenant (Isoladas)</w:t>
+        <w:t>### 2.2 Tabelas Por Tenant (Isoladas)</w:t>
         <w:br/>
         <w:br/>
         <w:t>Dados que **pertencem a um tenant específico** e devem ser isolados:</w:t>
@@ -10014,7 +10035,7 @@
           <w:sz w:val="18"/>
         </w:rPr>
         <w:br/>
-        <w:t>### 8.3 Regra Prática</w:t>
+        <w:t>### 2.3 Regra Prática</w:t>
         <w:br/>
       </w:r>
     </w:p>
@@ -10070,7 +10091,7 @@
           <w:sz w:val="18"/>
         </w:rPr>
         <w:br/>
-        <w:t>### 8.4 Implementação em Schema per Tenant</w:t>
+        <w:t>### 2.4 Implementação em Schema per Tenant</w:t>
         <w:br/>
       </w:r>
     </w:p>
@@ -10180,10 +10201,10 @@
         <w:t>---</w:t>
         <w:br/>
         <w:br/>
-        <w:t>## 9. Seed por Tenant</w:t>
-        <w:br/>
-        <w:br/>
-        <w:t>### 9.1 Seed Automático ao Criar Tenant</w:t>
+        <w:t>## 3. Seed por Tenant</w:t>
+        <w:br/>
+        <w:br/>
+        <w:t>### 3.1 Seed Automático ao Criar Tenant</w:t>
         <w:br/>
       </w:r>
     </w:p>
@@ -10432,7 +10453,7 @@
           <w:sz w:val="18"/>
         </w:rPr>
         <w:br/>
-        <w:t>### 9.2 Comandos CLI (NestJS Command)</w:t>
+        <w:t>### 3.2 Comandos CLI (NestJS Command)</w:t>
         <w:br/>
       </w:r>
     </w:p>
@@ -10530,7 +10551,7 @@
           <w:sz w:val="18"/>
         </w:rPr>
         <w:br/>
-        <w:t>### 9.3 Idempotência</w:t>
+        <w:t>### 3.3 Idempotência</w:t>
         <w:br/>
       </w:r>
     </w:p>
@@ -10592,10 +10613,25 @@
         <w:t>---</w:t>
         <w:br/>
         <w:br/>
-        <w:t>## 10. Backup e Restore</w:t>
-        <w:br/>
-        <w:br/>
-        <w:t>### 10.1 Database per Tenant</w:t>
+        <w:br/>
+        <w:br/>
+        <w:br/>
+        <w:t># Multi-Tenant: Operações e Qualidade</w:t>
+        <w:br/>
+        <w:br/>
+        <w:t># Módulo 13d — Multi-Tenant: Operações e Qualidade</w:t>
+        <w:br/>
+        <w:br/>
+        <w:t>**Backup, restore, performance, rate limiting, pricing baseado em tenancy e testes de isolamento.**</w:t>
+        <w:br/>
+        <w:br/>
+        <w:t>---</w:t>
+        <w:br/>
+        <w:br/>
+        <w:t>## 1. Backup e Restore</w:t>
+        <w:br/>
+        <w:br/>
+        <w:t>### 1.1 Database per Tenant</w:t>
         <w:br/>
       </w:r>
     </w:p>
@@ -10710,7 +10746,7 @@
           <w:sz w:val="18"/>
         </w:rPr>
         <w:br/>
-        <w:t>### 10.2 Schema per Tenant — Backup Seletivo</w:t>
+        <w:t>### 1.2 Schema per Tenant — Backup Seletivo</w:t>
         <w:br/>
       </w:r>
     </w:p>
@@ -10835,7 +10871,7 @@
           <w:sz w:val="18"/>
         </w:rPr>
         <w:br/>
-        <w:t>### 10.3 Estratégia por Plano</w:t>
+        <w:t>### 1.3 Estratégia por Plano</w:t>
         <w:br/>
         <w:br/>
         <w:t>| Plano | Backup | RPO (Recovery Point Objective) | RTO (Recovery Time Objective) |</w:t>
@@ -11002,10 +11038,10 @@
         <w:t>---</w:t>
         <w:br/>
         <w:br/>
-        <w:t>## 11. Performance</w:t>
-        <w:br/>
-        <w:br/>
-        <w:t>### 11.1 Connection Pooling por Tenant</w:t>
+        <w:t>## 2. Performance</w:t>
+        <w:br/>
+        <w:br/>
+        <w:t>### 2.1 Connection Pooling por Tenant</w:t>
         <w:br/>
       </w:r>
     </w:p>
@@ -11232,7 +11268,7 @@
           <w:sz w:val="18"/>
         </w:rPr>
         <w:br/>
-        <w:t>### 11.2 Query Optimization</w:t>
+        <w:t>### 2.2 Query Optimization</w:t>
         <w:br/>
       </w:r>
     </w:p>
@@ -11309,7 +11345,7 @@
           <w:sz w:val="18"/>
         </w:rPr>
         <w:br/>
-        <w:t>### 11.3 Rate Limiting por Tenant</w:t>
+        <w:t>### 2.3 Rate Limiting por Tenant</w:t>
         <w:br/>
       </w:r>
     </w:p>
@@ -11476,7 +11512,7 @@
           <w:sz w:val="18"/>
         </w:rPr>
         <w:br/>
-        <w:t>### 11.4 Indexação para Shared Database</w:t>
+        <w:t>### 2.4 Indexação para Shared Database</w:t>
         <w:br/>
       </w:r>
     </w:p>
@@ -11554,10 +11590,10 @@
         <w:t>---</w:t>
         <w:br/>
         <w:br/>
-        <w:t>## 12. Pricing Baseado em Tenancy</w:t>
-        <w:br/>
-        <w:br/>
-        <w:t>### 12.1 Modelo de Planos</w:t>
+        <w:t>## 3. Pricing Baseado em Tenancy</w:t>
+        <w:br/>
+        <w:br/>
+        <w:t>### 3.1 Modelo de Planos</w:t>
         <w:br/>
         <w:br/>
         <w:t>A arquitetura de isolamento escolhida define diretamente o que pode ser oferecido em cada plano:</w:t>
@@ -11576,7 +11612,7 @@
         <w:t>| **Enterprise** | DB per Tenant + Réplica | Ilimitado | $499/mês | Grandes clientes |</w:t>
         <w:br/>
         <w:br/>
-        <w:t>### 12.2 Feature Flags por Plano</w:t>
+        <w:t>### 3.2 Feature Flags por Plano</w:t>
         <w:br/>
       </w:r>
     </w:p>
@@ -11883,7 +11919,7 @@
           <w:sz w:val="18"/>
         </w:rPr>
         <w:br/>
-        <w:t>### 12.3 Guard do NestJS para Feature Flags</w:t>
+        <w:t>### 3.3 Guard do NestJS para Feature Flags</w:t>
         <w:br/>
       </w:r>
     </w:p>
@@ -11961,10 +11997,10 @@
         <w:t>---</w:t>
         <w:br/>
         <w:br/>
-        <w:t>## 13. Testes de Isolamento entre Tenants</w:t>
-        <w:br/>
-        <w:br/>
-        <w:t>### 13.1 Configuração de Teste</w:t>
+        <w:t>## 4. Testes de Isolamento entre Tenants</w:t>
+        <w:br/>
+        <w:br/>
+        <w:t>### 4.1 Configuração de Teste</w:t>
         <w:br/>
       </w:r>
     </w:p>
@@ -12077,7 +12113,7 @@
           <w:sz w:val="18"/>
         </w:rPr>
         <w:br/>
-        <w:t>### 13.2 Teste 1: Vazamento Zero</w:t>
+        <w:t>### 4.2 Teste 1: Vazamento Zero</w:t>
         <w:br/>
       </w:r>
     </w:p>
@@ -12198,7 +12234,7 @@
           <w:sz w:val="18"/>
         </w:rPr>
         <w:br/>
-        <w:t>### 13.3 Teste 2: Concorrência</w:t>
+        <w:t>### 4.3 Teste 2: Concorrência</w:t>
         <w:br/>
       </w:r>
     </w:p>
@@ -12328,7 +12364,7 @@
           <w:sz w:val="18"/>
         </w:rPr>
         <w:br/>
-        <w:t>### 13.4 Teste 3: Injeção de Tenant ID</w:t>
+        <w:t>### 4.4 Teste 3: Injeção de Tenant ID</w:t>
         <w:br/>
       </w:r>
     </w:p>
@@ -12405,7 +12441,7 @@
           <w:sz w:val="18"/>
         </w:rPr>
         <w:br/>
-        <w:t>### 13.5 Teste 4: Rate Limit</w:t>
+        <w:t>### 4.5 Teste 4: Rate Limit</w:t>
         <w:br/>
       </w:r>
     </w:p>
@@ -12494,7 +12530,7 @@
           <w:sz w:val="18"/>
         </w:rPr>
         <w:br/>
-        <w:t>### 13.6 Teste 5: Migrations</w:t>
+        <w:t>### 4.6 Teste 5: Migrations</w:t>
         <w:br/>
       </w:r>
     </w:p>
@@ -12558,7 +12594,7 @@
           <w:sz w:val="18"/>
         </w:rPr>
         <w:br/>
-        <w:t>### 13.7 Teste de Quebra Proposital</w:t>
+        <w:t>### 4.7 Teste de Quebra Proposital</w:t>
         <w:br/>
       </w:r>
     </w:p>
@@ -12649,6 +12685,27 @@
         <w:t xml:space="preserve">    });</w:t>
         <w:br/>
         <w:t xml:space="preserve">  });</w:t>
+      </w:r>
+    </w:p>
+    <w:p>
+      <w:pPr>
+        <w:spacing w:before="120" w:after="120"/>
+        <w:ind w:left="567"/>
+        <w:shd w:fill="263238" w:val="clear"/>
+        <w:pBdr>
+          <w:top w:val="single" w:sz="1" w:space="1" w:color="E0E0E0"/>
+          <w:left w:val="single" w:sz="1" w:space="1" w:color="E0E0E0"/>
+          <w:bottom w:val="single" w:sz="1" w:space="1" w:color="E0E0E0"/>
+          <w:right w:val="single" w:sz="1" w:space="1" w:color="E0E0E0"/>
+        </w:pBdr>
+      </w:pPr>
+      <w:r>
+        <w:rPr>
+          <w:rFonts w:ascii="Cascadia Code" w:hAnsi="Cascadia Code"/>
+          <w:color w:val="E0E0E0"/>
+          <w:sz w:val="18"/>
+        </w:rPr>
+        <w:br/>
       </w:r>
     </w:p>
     <w:sectPr>

</xml_diff>